<commit_message>
Aula 02 - MCP
</commit_message>
<xml_diff>
--- a/MCP/Lista de exercicios - Teoria dos conjuntos.docx
+++ b/MCP/Lista de exercicios - Teoria dos conjuntos.docx
@@ -4740,9 +4740,9 @@
 </file>
 
 <file path=customXml/item2.xml><?xml version="1.0" encoding="utf-8"?>
-<ct:contentTypeSchema xmlns:ct="http://schemas.microsoft.com/office/2006/metadata/contentType" xmlns:ma="http://schemas.microsoft.com/office/2006/metadata/properties/metaAttributes" ct:_="" ma:_="" ma:contentTypeName="Documento" ma:contentTypeID="0x010100E1A5309949B11C4CB16C511DFC2C6B89" ma:contentTypeVersion="3" ma:contentTypeDescription="Crie um novo documento." ma:contentTypeScope="" ma:versionID="1d29b50cf3fd3bad30ef15843b51a5ba">
-  <xsd:schema xmlns:xsd="http://www.w3.org/2001/XMLSchema" xmlns:xs="http://www.w3.org/2001/XMLSchema" xmlns:p="http://schemas.microsoft.com/office/2006/metadata/properties" xmlns:ns2="123d4502-9e17-4cff-b61c-384eaceecf46" targetNamespace="http://schemas.microsoft.com/office/2006/metadata/properties" ma:root="true" ma:fieldsID="71ecb686d0f0e9be58741ea6e3e46b0f" ns2:_="">
-    <xsd:import namespace="123d4502-9e17-4cff-b61c-384eaceecf46"/>
+<ct:contentTypeSchema xmlns:ct="http://schemas.microsoft.com/office/2006/metadata/contentType" xmlns:ma="http://schemas.microsoft.com/office/2006/metadata/properties/metaAttributes" ct:_="" ma:_="" ma:contentTypeName="Documento" ma:contentTypeID="0x0101006795F9309C3AB34BB3D82BE70F0FEC9D" ma:contentTypeVersion="3" ma:contentTypeDescription="Crie um novo documento." ma:contentTypeScope="" ma:versionID="a3d5773867c95953906a5b1532695b11">
+  <xsd:schema xmlns:xsd="http://www.w3.org/2001/XMLSchema" xmlns:xs="http://www.w3.org/2001/XMLSchema" xmlns:p="http://schemas.microsoft.com/office/2006/metadata/properties" xmlns:ns2="b3f78198-29fa-40dc-a64e-451b3f068329" targetNamespace="http://schemas.microsoft.com/office/2006/metadata/properties" ma:root="true" ma:fieldsID="2a40852e8a7760410dc32ff472734dd8" ns2:_="">
+    <xsd:import namespace="b3f78198-29fa-40dc-a64e-451b3f068329"/>
     <xsd:element name="properties">
       <xsd:complexType>
         <xsd:sequence>
@@ -4759,7 +4759,7 @@
       </xsd:complexType>
     </xsd:element>
   </xsd:schema>
-  <xsd:schema xmlns:xsd="http://www.w3.org/2001/XMLSchema" xmlns:xs="http://www.w3.org/2001/XMLSchema" xmlns:dms="http://schemas.microsoft.com/office/2006/documentManagement/types" xmlns:pc="http://schemas.microsoft.com/office/infopath/2007/PartnerControls" targetNamespace="123d4502-9e17-4cff-b61c-384eaceecf46" elementFormDefault="qualified">
+  <xsd:schema xmlns:xsd="http://www.w3.org/2001/XMLSchema" xmlns:xs="http://www.w3.org/2001/XMLSchema" xmlns:dms="http://schemas.microsoft.com/office/2006/documentManagement/types" xmlns:pc="http://schemas.microsoft.com/office/infopath/2007/PartnerControls" targetNamespace="b3f78198-29fa-40dc-a64e-451b3f068329" elementFormDefault="qualified">
     <xsd:import namespace="http://schemas.microsoft.com/office/2006/documentManagement/types"/>
     <xsd:import namespace="http://schemas.microsoft.com/office/infopath/2007/PartnerControls"/>
     <xsd:element name="MediaServiceMetadata" ma:index="8" nillable="true" ma:displayName="MediaServiceMetadata" ma:hidden="true" ma:internalName="MediaServiceMetadata" ma:readOnly="true">
@@ -4892,7 +4892,21 @@
 </file>
 
 <file path=customXml/itemProps2.xml><?xml version="1.0" encoding="utf-8"?>
-<ds:datastoreItem xmlns:ds="http://schemas.openxmlformats.org/officeDocument/2006/customXml" ds:itemID="{07522AEA-C04D-40A2-A959-52808C3EF222}"/>
+<ds:datastoreItem xmlns:ds="http://schemas.openxmlformats.org/officeDocument/2006/customXml" ds:itemID="{73A5E920-6B94-4AEB-94B3-F43B017B2289}">
+  <ds:schemaRefs>
+    <ds:schemaRef ds:uri="http://schemas.microsoft.com/office/2006/metadata/contentType"/>
+    <ds:schemaRef ds:uri="http://schemas.microsoft.com/office/2006/metadata/properties/metaAttributes"/>
+    <ds:schemaRef ds:uri="http://www.w3.org/2001/XMLSchema"/>
+    <ds:schemaRef ds:uri="http://schemas.microsoft.com/office/2006/metadata/properties"/>
+    <ds:schemaRef ds:uri="b3f78198-29fa-40dc-a64e-451b3f068329"/>
+    <ds:schemaRef ds:uri="http://schemas.microsoft.com/office/2006/documentManagement/types"/>
+    <ds:schemaRef ds:uri="http://schemas.microsoft.com/office/infopath/2007/PartnerControls"/>
+    <ds:schemaRef ds:uri="http://schemas.openxmlformats.org/package/2006/metadata/core-properties"/>
+    <ds:schemaRef ds:uri="http://purl.org/dc/elements/1.1/"/>
+    <ds:schemaRef ds:uri="http://purl.org/dc/terms/"/>
+    <ds:schemaRef ds:uri="http://schemas.microsoft.com/internal/obd"/>
+  </ds:schemaRefs>
+</ds:datastoreItem>
 </file>
 
 <file path=customXml/itemProps3.xml><?xml version="1.0" encoding="utf-8"?>

</xml_diff>